<commit_message>
Added link to GitHub source code
</commit_message>
<xml_diff>
--- a/Docs/MusicExplorerWasm.docx
+++ b/Docs/MusicExplorerWasm.docx
@@ -104,10 +104,7 @@
     </w:p>
     <w:p>
       <w:r>
-        <w:t>Microsoft</w:t>
-      </w:r>
-      <w:r>
-        <w:t xml:space="preserve"> Blazor is a web framework </w:t>
+        <w:t xml:space="preserve">Microsoft Blazor is a web framework </w:t>
       </w:r>
       <w:r>
         <w:t>that’s been around since 2018</w:t>
@@ -237,24 +234,14 @@
       <w:r>
         <w:t xml:space="preserve">Figure </w:t>
       </w:r>
-      <w:r>
-        <w:fldChar w:fldCharType="begin"/>
-      </w:r>
-      <w:r>
-        <w:instrText xml:space="preserve"> SEQ Figure \* ARABIC </w:instrText>
-      </w:r>
-      <w:r>
-        <w:fldChar w:fldCharType="separate"/>
-      </w:r>
-      <w:r>
-        <w:rPr>
-          <w:noProof/>
-        </w:rPr>
-        <w:t>1</w:t>
-      </w:r>
-      <w:r>
-        <w:fldChar w:fldCharType="end"/>
-      </w:r>
+      <w:fldSimple w:instr=" SEQ Figure \* ARABIC ">
+        <w:r>
+          <w:rPr>
+            <w:noProof/>
+          </w:rPr>
+          <w:t>1</w:t>
+        </w:r>
+      </w:fldSimple>
       <w:bookmarkEnd w:id="0"/>
       <w:r>
         <w:t xml:space="preserve"> - The MusicExplorer</w:t>
@@ -445,24 +432,14 @@
       <w:r>
         <w:t xml:space="preserve">Figure </w:t>
       </w:r>
-      <w:r>
-        <w:fldChar w:fldCharType="begin"/>
-      </w:r>
-      <w:r>
-        <w:instrText xml:space="preserve"> SEQ Figure \* ARABIC </w:instrText>
-      </w:r>
-      <w:r>
-        <w:fldChar w:fldCharType="separate"/>
-      </w:r>
-      <w:r>
-        <w:rPr>
-          <w:noProof/>
-        </w:rPr>
-        <w:t>2</w:t>
-      </w:r>
-      <w:r>
-        <w:fldChar w:fldCharType="end"/>
-      </w:r>
+      <w:fldSimple w:instr=" SEQ Figure \* ARABIC ">
+        <w:r>
+          <w:rPr>
+            <w:noProof/>
+          </w:rPr>
+          <w:t>2</w:t>
+        </w:r>
+      </w:fldSimple>
       <w:r>
         <w:t xml:space="preserve"> - The main operations of the app.</w:t>
       </w:r>
@@ -534,24 +511,14 @@
       <w:r>
         <w:t xml:space="preserve">Figure </w:t>
       </w:r>
-      <w:r>
-        <w:fldChar w:fldCharType="begin"/>
-      </w:r>
-      <w:r>
-        <w:instrText xml:space="preserve"> SEQ Figure \* ARABIC </w:instrText>
-      </w:r>
-      <w:r>
-        <w:fldChar w:fldCharType="separate"/>
-      </w:r>
-      <w:r>
-        <w:rPr>
-          <w:noProof/>
-        </w:rPr>
-        <w:t>3</w:t>
-      </w:r>
-      <w:r>
-        <w:fldChar w:fldCharType="end"/>
-      </w:r>
+      <w:fldSimple w:instr=" SEQ Figure \* ARABIC ">
+        <w:r>
+          <w:rPr>
+            <w:noProof/>
+          </w:rPr>
+          <w:t>3</w:t>
+        </w:r>
+      </w:fldSimple>
       <w:r>
         <w:t xml:space="preserve"> - The class hierarchy of web services.</w:t>
       </w:r>
@@ -667,24 +634,14 @@
       <w:r>
         <w:t xml:space="preserve">Figure </w:t>
       </w:r>
-      <w:r>
-        <w:fldChar w:fldCharType="begin"/>
-      </w:r>
-      <w:r>
-        <w:instrText xml:space="preserve"> SEQ Figure \* ARABIC </w:instrText>
-      </w:r>
-      <w:r>
-        <w:fldChar w:fldCharType="separate"/>
-      </w:r>
-      <w:r>
-        <w:rPr>
-          <w:noProof/>
-        </w:rPr>
-        <w:t>4</w:t>
-      </w:r>
-      <w:r>
-        <w:fldChar w:fldCharType="end"/>
-      </w:r>
+      <w:fldSimple w:instr=" SEQ Figure \* ARABIC ">
+        <w:r>
+          <w:rPr>
+            <w:noProof/>
+          </w:rPr>
+          <w:t>4</w:t>
+        </w:r>
+      </w:fldSimple>
       <w:r>
         <w:t xml:space="preserve"> - The </w:t>
       </w:r>
@@ -704,10 +661,7 @@
         </w:numPr>
       </w:pPr>
       <w:r>
-        <w:t xml:space="preserve">Layer 1: Shown in </w:t>
-      </w:r>
-      <w:r>
-        <w:t>purple, is the main page which acts as a flex container for the other layers.</w:t>
+        <w:t>Layer 1: Shown in purple, is the main page which acts as a flex container for the other layers.</w:t>
       </w:r>
     </w:p>
     <w:p>
@@ -791,27 +745,17 @@
       <w:r>
         <w:t xml:space="preserve"> in </w:t>
       </w:r>
-      <w:r>
-        <w:fldChar w:fldCharType="begin"/>
-      </w:r>
-      <w:r>
-        <w:instrText xml:space="preserve"> REF _Ref239531654 </w:instrText>
-      </w:r>
-      <w:r>
-        <w:fldChar w:fldCharType="separate"/>
-      </w:r>
-      <w:r>
-        <w:t xml:space="preserve">Figure </w:t>
-      </w:r>
-      <w:r>
-        <w:rPr>
-          <w:noProof/>
-        </w:rPr>
-        <w:t>1</w:t>
-      </w:r>
-      <w:r>
-        <w:fldChar w:fldCharType="end"/>
-      </w:r>
+      <w:fldSimple w:instr=" REF _Ref239531654 ">
+        <w:r>
+          <w:t xml:space="preserve">Figure </w:t>
+        </w:r>
+        <w:r>
+          <w:rPr>
+            <w:noProof/>
+          </w:rPr>
+          <w:t>1</w:t>
+        </w:r>
+      </w:fldSimple>
       <w:r>
         <w:t>)</w:t>
       </w:r>
@@ -1211,32 +1155,16 @@
       <w:r>
         <w:t xml:space="preserve">Listing </w:t>
       </w:r>
-      <w:r>
-        <w:fldChar w:fldCharType="begin"/>
-      </w:r>
-      <w:r>
-        <w:instrText xml:space="preserve"> SEQ Listing \* ARABIC </w:instrText>
-      </w:r>
-      <w:r>
-        <w:fldChar w:fldCharType="separate"/>
-      </w:r>
-      <w:r>
-        <w:rPr>
-          <w:noProof/>
-        </w:rPr>
-        <w:t>1</w:t>
-      </w:r>
-      <w:r>
-        <w:fldChar w:fldCharType="end"/>
-      </w:r>
-      <w:r>
-        <w:t xml:space="preserve">- The </w:t>
-      </w:r>
-      <w:r>
-        <w:t>class that manages the app’s persistent user settings</w:t>
-      </w:r>
-      <w:r>
-        <w:t>.</w:t>
+      <w:fldSimple w:instr=" SEQ Listing \* ARABIC ">
+        <w:r>
+          <w:rPr>
+            <w:noProof/>
+          </w:rPr>
+          <w:t>1</w:t>
+        </w:r>
+      </w:fldSimple>
+      <w:r>
+        <w:t>- The class that manages the app’s persistent user settings.</w:t>
       </w:r>
     </w:p>
     <w:p>
@@ -1357,178 +1285,472 @@
       <w:r>
         <w:t xml:space="preserve">Figure </w:t>
       </w:r>
-      <w:r>
-        <w:fldChar w:fldCharType="begin"/>
-      </w:r>
-      <w:r>
-        <w:instrText xml:space="preserve"> SEQ Figure \* ARABIC </w:instrText>
-      </w:r>
-      <w:r>
-        <w:fldChar w:fldCharType="separate"/>
-      </w:r>
-      <w:r>
-        <w:rPr>
-          <w:noProof/>
-        </w:rPr>
-        <w:t>5</w:t>
-      </w:r>
-      <w:r>
-        <w:fldChar w:fldCharType="end"/>
+      <w:fldSimple w:instr=" SEQ Figure \* ARABIC ">
+        <w:r>
+          <w:rPr>
+            <w:noProof/>
+          </w:rPr>
+          <w:t>5</w:t>
+        </w:r>
+      </w:fldSimple>
+      <w:r>
+        <w:t xml:space="preserve"> – </w:t>
+      </w:r>
+      <w:r>
+        <w:t>Using the browser’s Dev Tools to inspect</w:t>
+      </w:r>
+      <w:r>
+        <w:t xml:space="preserve"> user settings in Local Storage.</w:t>
+      </w:r>
+    </w:p>
+    <w:p>
+      <w:r>
+        <w:t>W</w:t>
+      </w:r>
+      <w:r>
+        <w:t xml:space="preserve">e load the Artist settings </w:t>
+      </w:r>
+      <w:r>
+        <w:t xml:space="preserve">during initialization </w:t>
+      </w:r>
+      <w:r>
+        <w:t>of the Home page</w:t>
+      </w:r>
+      <w:r>
+        <w:t>:</w:t>
+      </w:r>
+    </w:p>
+    <w:p>
+      <w:pPr>
+        <w:spacing w:after="0"/>
+        <w:rPr>
+          <w:rFonts w:ascii="Courier New" w:hAnsi="Courier New" w:cs="Courier New"/>
+          <w:noProof/>
+          <w:sz w:val="18"/>
+          <w:szCs w:val="18"/>
+        </w:rPr>
+      </w:pPr>
+      <w:r>
+        <w:rPr>
+          <w:rFonts w:ascii="Courier New" w:hAnsi="Courier New" w:cs="Courier New"/>
+          <w:noProof/>
+          <w:sz w:val="18"/>
+          <w:szCs w:val="18"/>
+        </w:rPr>
+        <w:t>protected override async Task OnAfterRenderAsync(bool firstRender)</w:t>
+      </w:r>
+    </w:p>
+    <w:p>
+      <w:pPr>
+        <w:spacing w:after="0"/>
+        <w:rPr>
+          <w:rFonts w:ascii="Courier New" w:hAnsi="Courier New" w:cs="Courier New"/>
+          <w:noProof/>
+          <w:sz w:val="18"/>
+          <w:szCs w:val="18"/>
+        </w:rPr>
+      </w:pPr>
+      <w:r>
+        <w:rPr>
+          <w:rFonts w:ascii="Courier New" w:hAnsi="Courier New" w:cs="Courier New"/>
+          <w:noProof/>
+          <w:sz w:val="18"/>
+          <w:szCs w:val="18"/>
+        </w:rPr>
+        <w:t>{</w:t>
+      </w:r>
+    </w:p>
+    <w:p>
+      <w:pPr>
+        <w:spacing w:after="0"/>
+        <w:rPr>
+          <w:rFonts w:ascii="Courier New" w:hAnsi="Courier New" w:cs="Courier New"/>
+          <w:noProof/>
+          <w:sz w:val="18"/>
+          <w:szCs w:val="18"/>
+        </w:rPr>
+      </w:pPr>
+      <w:r>
+        <w:rPr>
+          <w:rFonts w:ascii="Courier New" w:hAnsi="Courier New" w:cs="Courier New"/>
+          <w:noProof/>
+          <w:sz w:val="18"/>
+          <w:szCs w:val="18"/>
+        </w:rPr>
+        <w:t xml:space="preserve">  if (!firstRender) return;</w:t>
+      </w:r>
+    </w:p>
+    <w:p>
+      <w:pPr>
+        <w:spacing w:after="0"/>
+        <w:rPr>
+          <w:rFonts w:ascii="Courier New" w:hAnsi="Courier New" w:cs="Courier New"/>
+          <w:noProof/>
+          <w:sz w:val="18"/>
+          <w:szCs w:val="18"/>
+        </w:rPr>
+      </w:pPr>
+      <w:r>
+        <w:rPr>
+          <w:rFonts w:ascii="Courier New" w:hAnsi="Courier New" w:cs="Courier New"/>
+          <w:noProof/>
+          <w:sz w:val="18"/>
+          <w:szCs w:val="18"/>
+        </w:rPr>
+        <w:t xml:space="preserve">  artist = await persistentData.GetItemAsync&lt;string&gt;(PersistentData.ArtistKey) ?? "";</w:t>
+      </w:r>
+    </w:p>
+    <w:p>
+      <w:pPr>
+        <w:spacing w:after="0"/>
+        <w:rPr>
+          <w:rFonts w:ascii="Courier New" w:hAnsi="Courier New" w:cs="Courier New"/>
+          <w:noProof/>
+          <w:sz w:val="18"/>
+          <w:szCs w:val="18"/>
+        </w:rPr>
+      </w:pPr>
+      <w:r>
+        <w:rPr>
+          <w:rFonts w:ascii="Courier New" w:hAnsi="Courier New" w:cs="Courier New"/>
+          <w:noProof/>
+          <w:sz w:val="18"/>
+          <w:szCs w:val="18"/>
+        </w:rPr>
+        <w:t xml:space="preserve">  StateHasChanged();</w:t>
+      </w:r>
+    </w:p>
+    <w:p>
+      <w:pPr>
+        <w:spacing w:after="0"/>
+        <w:rPr>
+          <w:rFonts w:ascii="Courier New" w:hAnsi="Courier New" w:cs="Courier New"/>
+          <w:noProof/>
+          <w:sz w:val="18"/>
+          <w:szCs w:val="18"/>
+        </w:rPr>
+      </w:pPr>
+      <w:r>
+        <w:rPr>
+          <w:rFonts w:ascii="Courier New" w:hAnsi="Courier New" w:cs="Courier New"/>
+          <w:noProof/>
+          <w:sz w:val="18"/>
+          <w:szCs w:val="18"/>
+        </w:rPr>
+        <w:t>}</w:t>
+      </w:r>
+    </w:p>
+    <w:p>
+      <w:pPr>
+        <w:spacing w:after="0"/>
+        <w:rPr>
+          <w:rStyle w:val="code"/>
+        </w:rPr>
+      </w:pPr>
+    </w:p>
+    <w:p>
+      <w:pPr>
+        <w:pStyle w:val="Caption"/>
+      </w:pPr>
+      <w:r>
+        <w:t xml:space="preserve">Listing </w:t>
+      </w:r>
+      <w:fldSimple w:instr=" SEQ Listing \* ARABIC ">
+        <w:r>
+          <w:rPr>
+            <w:noProof/>
+          </w:rPr>
+          <w:t>2</w:t>
+        </w:r>
+      </w:fldSimple>
+      <w:r>
+        <w:t>- Loading settings at startup time.</w:t>
+      </w:r>
+    </w:p>
+    <w:p>
+      <w:r>
+        <w:t>Saving updated settings is just as easy</w:t>
+      </w:r>
+      <w:r>
+        <w:t>. We save the artist</w:t>
+      </w:r>
+      <w:r>
+        <w:t>’s</w:t>
+      </w:r>
+      <w:r>
+        <w:t xml:space="preserve"> name when the user clicks the Search button</w:t>
+      </w:r>
+      <w:r>
+        <w:t>:</w:t>
+      </w:r>
+    </w:p>
+    <w:p>
+      <w:pPr>
+        <w:spacing w:after="0"/>
+        <w:rPr>
+          <w:rFonts w:ascii="Courier New" w:hAnsi="Courier New" w:cs="Courier New"/>
+          <w:noProof/>
+          <w:sz w:val="18"/>
+          <w:szCs w:val="18"/>
+        </w:rPr>
+      </w:pPr>
+      <w:r>
+        <w:rPr>
+          <w:rFonts w:ascii="Courier New" w:hAnsi="Courier New" w:cs="Courier New"/>
+          <w:noProof/>
+          <w:sz w:val="18"/>
+          <w:szCs w:val="18"/>
+        </w:rPr>
+        <w:t xml:space="preserve"> async void SearchButton_Clicked(string theArtist)</w:t>
+      </w:r>
+    </w:p>
+    <w:p>
+      <w:pPr>
+        <w:spacing w:after="0"/>
+        <w:rPr>
+          <w:rFonts w:ascii="Courier New" w:hAnsi="Courier New" w:cs="Courier New"/>
+          <w:noProof/>
+          <w:sz w:val="18"/>
+          <w:szCs w:val="18"/>
+        </w:rPr>
+      </w:pPr>
+      <w:r>
+        <w:rPr>
+          <w:rFonts w:ascii="Courier New" w:hAnsi="Courier New" w:cs="Courier New"/>
+          <w:noProof/>
+          <w:sz w:val="18"/>
+          <w:szCs w:val="18"/>
+        </w:rPr>
+        <w:t xml:space="preserve"> {</w:t>
+      </w:r>
+    </w:p>
+    <w:p>
+      <w:pPr>
+        <w:spacing w:after="0"/>
+        <w:rPr>
+          <w:rFonts w:ascii="Courier New" w:hAnsi="Courier New" w:cs="Courier New"/>
+          <w:noProof/>
+          <w:sz w:val="18"/>
+          <w:szCs w:val="18"/>
+        </w:rPr>
+      </w:pPr>
+      <w:r>
+        <w:rPr>
+          <w:rFonts w:ascii="Courier New" w:hAnsi="Courier New" w:cs="Courier New"/>
+          <w:noProof/>
+          <w:sz w:val="18"/>
+          <w:szCs w:val="18"/>
+        </w:rPr>
+        <w:t xml:space="preserve">   artist = theArtist;</w:t>
+      </w:r>
+    </w:p>
+    <w:p>
+      <w:pPr>
+        <w:spacing w:after="0"/>
+        <w:rPr>
+          <w:rFonts w:ascii="Courier New" w:hAnsi="Courier New" w:cs="Courier New"/>
+          <w:noProof/>
+          <w:sz w:val="18"/>
+          <w:szCs w:val="18"/>
+        </w:rPr>
+      </w:pPr>
+      <w:r>
+        <w:rPr>
+          <w:rFonts w:ascii="Courier New" w:hAnsi="Courier New" w:cs="Courier New"/>
+          <w:noProof/>
+          <w:sz w:val="18"/>
+          <w:szCs w:val="18"/>
+        </w:rPr>
+        <w:t xml:space="preserve">   await persistentData.SetItemAsync(PersistentData.ArtistKey, artist);</w:t>
+      </w:r>
+    </w:p>
+    <w:p>
+      <w:pPr>
+        <w:spacing w:after="0"/>
+        <w:rPr>
+          <w:rFonts w:ascii="Courier New" w:hAnsi="Courier New" w:cs="Courier New"/>
+          <w:noProof/>
+          <w:sz w:val="18"/>
+          <w:szCs w:val="18"/>
+        </w:rPr>
+      </w:pPr>
+      <w:r>
+        <w:rPr>
+          <w:rFonts w:ascii="Courier New" w:hAnsi="Courier New" w:cs="Courier New"/>
+          <w:noProof/>
+          <w:sz w:val="18"/>
+          <w:szCs w:val="18"/>
+        </w:rPr>
+        <w:t xml:space="preserve">   mainContent!.FindArtistAlbums(artist);</w:t>
+      </w:r>
+    </w:p>
+    <w:p>
+      <w:pPr>
+        <w:spacing w:after="0"/>
+        <w:rPr>
+          <w:rFonts w:ascii="Courier New" w:hAnsi="Courier New" w:cs="Courier New"/>
+          <w:noProof/>
+          <w:sz w:val="18"/>
+          <w:szCs w:val="18"/>
+        </w:rPr>
+      </w:pPr>
+      <w:r>
+        <w:rPr>
+          <w:rFonts w:ascii="Courier New" w:hAnsi="Courier New" w:cs="Courier New"/>
+          <w:noProof/>
+          <w:sz w:val="18"/>
+          <w:szCs w:val="18"/>
+        </w:rPr>
+        <w:t xml:space="preserve"> }</w:t>
+      </w:r>
+    </w:p>
+    <w:p>
+      <w:pPr>
+        <w:spacing w:after="0"/>
+        <w:rPr>
+          <w:rStyle w:val="code"/>
+        </w:rPr>
+      </w:pPr>
+    </w:p>
+    <w:p>
+      <w:pPr>
+        <w:pStyle w:val="Caption"/>
+      </w:pPr>
+      <w:r>
+        <w:t xml:space="preserve">Listing </w:t>
+      </w:r>
+      <w:fldSimple w:instr=" SEQ Listing \* ARABIC ">
+        <w:r>
+          <w:rPr>
+            <w:noProof/>
+          </w:rPr>
+          <w:t>3</w:t>
+        </w:r>
+      </w:fldSimple>
+      <w:r>
+        <w:t>- Saving user settings.</w:t>
+      </w:r>
+    </w:p>
+    <w:p>
+      <w:pPr>
+        <w:pStyle w:val="Heading1"/>
+      </w:pPr>
+      <w:r>
+        <w:t>Showing HTTP Traffic</w:t>
+      </w:r>
+    </w:p>
+    <w:p>
+      <w:r>
+        <w:t xml:space="preserve">The MainContent component </w:t>
+      </w:r>
+      <w:r>
+        <w:t>uses</w:t>
       </w:r>
       <w:r>
         <w:t xml:space="preserve"> </w:t>
       </w:r>
       <w:r>
-        <w:t>–</w:t>
-      </w:r>
-      <w:r>
-        <w:t xml:space="preserve"> </w:t>
-      </w:r>
-      <w:r>
-        <w:t>Using the browser’s Dev Tools to inspect</w:t>
-      </w:r>
-      <w:r>
-        <w:t xml:space="preserve"> user settings in Local Storage</w:t>
-      </w:r>
-      <w:r>
-        <w:t>.</w:t>
-      </w:r>
-    </w:p>
-    <w:p>
-      <w:r>
-        <w:t>W</w:t>
-      </w:r>
-      <w:r>
-        <w:t xml:space="preserve">e load the Artist settings </w:t>
-      </w:r>
-      <w:r>
-        <w:t xml:space="preserve">during initialization </w:t>
-      </w:r>
-      <w:r>
-        <w:t>of the Home page</w:t>
-      </w:r>
-      <w:r>
-        <w:t>:</w:t>
-      </w:r>
-    </w:p>
-    <w:p>
-      <w:pPr>
-        <w:spacing w:after="0"/>
-        <w:rPr>
-          <w:rFonts w:ascii="Courier New" w:hAnsi="Courier New" w:cs="Courier New"/>
-          <w:noProof/>
-          <w:sz w:val="18"/>
-          <w:szCs w:val="18"/>
-        </w:rPr>
-      </w:pPr>
-      <w:r>
-        <w:rPr>
-          <w:rFonts w:ascii="Courier New" w:hAnsi="Courier New" w:cs="Courier New"/>
-          <w:noProof/>
-          <w:sz w:val="18"/>
-          <w:szCs w:val="18"/>
-        </w:rPr>
-        <w:t>protected override async Task OnAfterRenderAsync(bool firstRender)</w:t>
-      </w:r>
-    </w:p>
-    <w:p>
-      <w:pPr>
-        <w:spacing w:after="0"/>
-        <w:rPr>
-          <w:rFonts w:ascii="Courier New" w:hAnsi="Courier New" w:cs="Courier New"/>
-          <w:noProof/>
-          <w:sz w:val="18"/>
-          <w:szCs w:val="18"/>
-        </w:rPr>
-      </w:pPr>
-      <w:r>
-        <w:rPr>
-          <w:rFonts w:ascii="Courier New" w:hAnsi="Courier New" w:cs="Courier New"/>
-          <w:noProof/>
-          <w:sz w:val="18"/>
-          <w:szCs w:val="18"/>
-        </w:rPr>
-        <w:t>{</w:t>
-      </w:r>
-    </w:p>
-    <w:p>
-      <w:pPr>
-        <w:spacing w:after="0"/>
-        <w:rPr>
-          <w:rFonts w:ascii="Courier New" w:hAnsi="Courier New" w:cs="Courier New"/>
-          <w:noProof/>
-          <w:sz w:val="18"/>
-          <w:szCs w:val="18"/>
-        </w:rPr>
-      </w:pPr>
-      <w:r>
-        <w:rPr>
-          <w:rFonts w:ascii="Courier New" w:hAnsi="Courier New" w:cs="Courier New"/>
-          <w:noProof/>
-          <w:sz w:val="18"/>
-          <w:szCs w:val="18"/>
-        </w:rPr>
-        <w:t xml:space="preserve">  if (!firstRender) return;</w:t>
-      </w:r>
-    </w:p>
-    <w:p>
-      <w:pPr>
-        <w:spacing w:after="0"/>
-        <w:rPr>
-          <w:rFonts w:ascii="Courier New" w:hAnsi="Courier New" w:cs="Courier New"/>
-          <w:noProof/>
-          <w:sz w:val="18"/>
-          <w:szCs w:val="18"/>
-        </w:rPr>
-      </w:pPr>
-      <w:r>
-        <w:rPr>
-          <w:rFonts w:ascii="Courier New" w:hAnsi="Courier New" w:cs="Courier New"/>
-          <w:noProof/>
-          <w:sz w:val="18"/>
-          <w:szCs w:val="18"/>
-        </w:rPr>
-        <w:t xml:space="preserve">  artist = await persistentData.GetItemAsync&lt;string&gt;(PersistentData.ArtistKey) ?? "";</w:t>
-      </w:r>
-    </w:p>
-    <w:p>
-      <w:pPr>
-        <w:spacing w:after="0"/>
-        <w:rPr>
-          <w:rFonts w:ascii="Courier New" w:hAnsi="Courier New" w:cs="Courier New"/>
-          <w:noProof/>
-          <w:sz w:val="18"/>
-          <w:szCs w:val="18"/>
-        </w:rPr>
-      </w:pPr>
-      <w:r>
-        <w:rPr>
-          <w:rFonts w:ascii="Courier New" w:hAnsi="Courier New" w:cs="Courier New"/>
-          <w:noProof/>
-          <w:sz w:val="18"/>
-          <w:szCs w:val="18"/>
-        </w:rPr>
-        <w:t xml:space="preserve">  StateHasChanged();</w:t>
-      </w:r>
-    </w:p>
-    <w:p>
-      <w:pPr>
-        <w:spacing w:after="0"/>
-        <w:rPr>
-          <w:rFonts w:ascii="Courier New" w:hAnsi="Courier New" w:cs="Courier New"/>
-          <w:noProof/>
-          <w:sz w:val="18"/>
-          <w:szCs w:val="18"/>
-        </w:rPr>
-      </w:pPr>
-      <w:r>
-        <w:rPr>
-          <w:rFonts w:ascii="Courier New" w:hAnsi="Courier New" w:cs="Courier New"/>
-          <w:noProof/>
-          <w:sz w:val="18"/>
-          <w:szCs w:val="18"/>
-        </w:rPr>
-        <w:t>}</w:t>
+        <w:t xml:space="preserve">the </w:t>
+      </w:r>
+      <w:r>
+        <w:t xml:space="preserve">HTTP </w:t>
+      </w:r>
+      <w:r>
+        <w:t xml:space="preserve">services MusicBrainz, CoverArtArchive and LrcLib </w:t>
+      </w:r>
+      <w:r>
+        <w:t xml:space="preserve">to </w:t>
+      </w:r>
+      <w:r>
+        <w:t>get</w:t>
+      </w:r>
+      <w:r>
+        <w:t xml:space="preserve"> data</w:t>
+      </w:r>
+      <w:r>
+        <w:t>. In Blazor, which is based on ASP.NET, we don’t instantiate services directly. Instead, we tell the application Builder to create the service for us, as shown in the next listing.</w:t>
+      </w:r>
+    </w:p>
+    <w:p>
+      <w:pPr>
+        <w:spacing w:after="0"/>
+        <w:rPr>
+          <w:rFonts w:ascii="Courier New" w:hAnsi="Courier New" w:cs="Courier New"/>
+          <w:noProof/>
+          <w:sz w:val="18"/>
+          <w:szCs w:val="18"/>
+        </w:rPr>
+      </w:pPr>
+      <w:r>
+        <w:rPr>
+          <w:rFonts w:ascii="Courier New" w:hAnsi="Courier New" w:cs="Courier New"/>
+          <w:noProof/>
+          <w:sz w:val="18"/>
+          <w:szCs w:val="18"/>
+        </w:rPr>
+        <w:t>var builder = WebAssemblyHostBuilder.CreateDefault(args);</w:t>
+      </w:r>
+    </w:p>
+    <w:p>
+      <w:pPr>
+        <w:spacing w:after="0"/>
+        <w:rPr>
+          <w:rFonts w:ascii="Courier New" w:hAnsi="Courier New" w:cs="Courier New"/>
+          <w:noProof/>
+          <w:sz w:val="18"/>
+          <w:szCs w:val="18"/>
+        </w:rPr>
+      </w:pPr>
+      <w:r>
+        <w:rPr>
+          <w:rFonts w:ascii="Courier New" w:hAnsi="Courier New" w:cs="Courier New"/>
+          <w:noProof/>
+          <w:sz w:val="18"/>
+          <w:szCs w:val="18"/>
+        </w:rPr>
+        <w:t>//...</w:t>
+      </w:r>
+    </w:p>
+    <w:p>
+      <w:pPr>
+        <w:spacing w:after="0"/>
+        <w:rPr>
+          <w:rStyle w:val="code"/>
+        </w:rPr>
+      </w:pPr>
+      <w:r>
+        <w:rPr>
+          <w:rStyle w:val="code"/>
+        </w:rPr>
+        <w:t>builder.Services.AddHttpClient&lt;MusicBrainz&gt;();</w:t>
+      </w:r>
+    </w:p>
+    <w:p>
+      <w:pPr>
+        <w:spacing w:after="0"/>
+        <w:rPr>
+          <w:rStyle w:val="code"/>
+        </w:rPr>
+      </w:pPr>
+      <w:r>
+        <w:rPr>
+          <w:rStyle w:val="code"/>
+        </w:rPr>
+        <w:t>builder.Services.AddHttpClient&lt;CoverArtArchive&gt;();</w:t>
+      </w:r>
+    </w:p>
+    <w:p>
+      <w:pPr>
+        <w:spacing w:after="0"/>
+        <w:rPr>
+          <w:rStyle w:val="code"/>
+        </w:rPr>
+      </w:pPr>
+      <w:r>
+        <w:rPr>
+          <w:rStyle w:val="code"/>
+        </w:rPr>
+        <w:t>builder.Services.AddHttpClient&lt;LrcLib&gt;();</w:t>
       </w:r>
     </w:p>
     <w:p>
@@ -1546,362 +1768,16 @@
       <w:r>
         <w:t xml:space="preserve">Listing </w:t>
       </w:r>
-      <w:r>
-        <w:fldChar w:fldCharType="begin"/>
-      </w:r>
-      <w:r>
-        <w:instrText xml:space="preserve"> SEQ Listing \* ARABIC </w:instrText>
-      </w:r>
-      <w:r>
-        <w:fldChar w:fldCharType="separate"/>
-      </w:r>
-      <w:r>
-        <w:rPr>
-          <w:noProof/>
-        </w:rPr>
-        <w:t>2</w:t>
-      </w:r>
-      <w:r>
-        <w:fldChar w:fldCharType="end"/>
-      </w:r>
-      <w:r>
-        <w:t>- Loading settings at startup time.</w:t>
-      </w:r>
-    </w:p>
-    <w:p>
-      <w:r>
-        <w:t>Saving updated settings is just as easy</w:t>
-      </w:r>
-      <w:r>
-        <w:t>. We save the artist</w:t>
-      </w:r>
-      <w:r>
-        <w:t>’s</w:t>
-      </w:r>
-      <w:r>
-        <w:t xml:space="preserve"> name when the user clicks the Search button</w:t>
-      </w:r>
-      <w:r>
-        <w:t>:</w:t>
-      </w:r>
-    </w:p>
-    <w:p>
-      <w:pPr>
-        <w:spacing w:after="0"/>
-        <w:rPr>
-          <w:rFonts w:ascii="Courier New" w:hAnsi="Courier New" w:cs="Courier New"/>
-          <w:noProof/>
-          <w:sz w:val="18"/>
-          <w:szCs w:val="18"/>
-        </w:rPr>
-      </w:pPr>
-      <w:r>
-        <w:rPr>
-          <w:rFonts w:ascii="Courier New" w:hAnsi="Courier New" w:cs="Courier New"/>
-          <w:noProof/>
-          <w:sz w:val="18"/>
-          <w:szCs w:val="18"/>
-        </w:rPr>
-        <w:t xml:space="preserve"> async void SearchButton_Clicked(string theArtist)</w:t>
-      </w:r>
-    </w:p>
-    <w:p>
-      <w:pPr>
-        <w:spacing w:after="0"/>
-        <w:rPr>
-          <w:rFonts w:ascii="Courier New" w:hAnsi="Courier New" w:cs="Courier New"/>
-          <w:noProof/>
-          <w:sz w:val="18"/>
-          <w:szCs w:val="18"/>
-        </w:rPr>
-      </w:pPr>
-      <w:r>
-        <w:rPr>
-          <w:rFonts w:ascii="Courier New" w:hAnsi="Courier New" w:cs="Courier New"/>
-          <w:noProof/>
-          <w:sz w:val="18"/>
-          <w:szCs w:val="18"/>
-        </w:rPr>
-        <w:t xml:space="preserve"> {</w:t>
-      </w:r>
-    </w:p>
-    <w:p>
-      <w:pPr>
-        <w:spacing w:after="0"/>
-        <w:rPr>
-          <w:rFonts w:ascii="Courier New" w:hAnsi="Courier New" w:cs="Courier New"/>
-          <w:noProof/>
-          <w:sz w:val="18"/>
-          <w:szCs w:val="18"/>
-        </w:rPr>
-      </w:pPr>
-      <w:r>
-        <w:rPr>
-          <w:rFonts w:ascii="Courier New" w:hAnsi="Courier New" w:cs="Courier New"/>
-          <w:noProof/>
-          <w:sz w:val="18"/>
-          <w:szCs w:val="18"/>
-        </w:rPr>
-        <w:t xml:space="preserve">   artist = theArtist;</w:t>
-      </w:r>
-    </w:p>
-    <w:p>
-      <w:pPr>
-        <w:spacing w:after="0"/>
-        <w:rPr>
-          <w:rFonts w:ascii="Courier New" w:hAnsi="Courier New" w:cs="Courier New"/>
-          <w:noProof/>
-          <w:sz w:val="18"/>
-          <w:szCs w:val="18"/>
-        </w:rPr>
-      </w:pPr>
-      <w:r>
-        <w:rPr>
-          <w:rFonts w:ascii="Courier New" w:hAnsi="Courier New" w:cs="Courier New"/>
-          <w:noProof/>
-          <w:sz w:val="18"/>
-          <w:szCs w:val="18"/>
-        </w:rPr>
-        <w:t xml:space="preserve">   await persistentData.SetItemAsync(PersistentData.ArtistKey, artist);</w:t>
-      </w:r>
-    </w:p>
-    <w:p>
-      <w:pPr>
-        <w:spacing w:after="0"/>
-        <w:rPr>
-          <w:rFonts w:ascii="Courier New" w:hAnsi="Courier New" w:cs="Courier New"/>
-          <w:noProof/>
-          <w:sz w:val="18"/>
-          <w:szCs w:val="18"/>
-        </w:rPr>
-      </w:pPr>
-      <w:r>
-        <w:rPr>
-          <w:rFonts w:ascii="Courier New" w:hAnsi="Courier New" w:cs="Courier New"/>
-          <w:noProof/>
-          <w:sz w:val="18"/>
-          <w:szCs w:val="18"/>
-        </w:rPr>
-        <w:t xml:space="preserve">   mainContent!.FindArtistAlbums(artist);</w:t>
-      </w:r>
-    </w:p>
-    <w:p>
-      <w:pPr>
-        <w:spacing w:after="0"/>
-        <w:rPr>
-          <w:rFonts w:ascii="Courier New" w:hAnsi="Courier New" w:cs="Courier New"/>
-          <w:noProof/>
-          <w:sz w:val="18"/>
-          <w:szCs w:val="18"/>
-        </w:rPr>
-      </w:pPr>
-      <w:r>
-        <w:rPr>
-          <w:rFonts w:ascii="Courier New" w:hAnsi="Courier New" w:cs="Courier New"/>
-          <w:noProof/>
-          <w:sz w:val="18"/>
-          <w:szCs w:val="18"/>
-        </w:rPr>
-        <w:t xml:space="preserve"> }</w:t>
-      </w:r>
-    </w:p>
-    <w:p>
-      <w:pPr>
-        <w:spacing w:after="0"/>
-        <w:rPr>
-          <w:rStyle w:val="code"/>
-        </w:rPr>
-      </w:pPr>
-    </w:p>
-    <w:p>
-      <w:pPr>
-        <w:pStyle w:val="Caption"/>
-      </w:pPr>
-      <w:r>
-        <w:t xml:space="preserve">Listing </w:t>
-      </w:r>
-      <w:r>
-        <w:fldChar w:fldCharType="begin"/>
-      </w:r>
-      <w:r>
-        <w:instrText xml:space="preserve"> SEQ Listing \* ARABIC </w:instrText>
-      </w:r>
-      <w:r>
-        <w:fldChar w:fldCharType="separate"/>
-      </w:r>
-      <w:r>
-        <w:rPr>
-          <w:noProof/>
-        </w:rPr>
-        <w:t>3</w:t>
-      </w:r>
-      <w:r>
-        <w:fldChar w:fldCharType="end"/>
-      </w:r>
-      <w:r>
-        <w:t>- Saving user settings.</w:t>
-      </w:r>
-    </w:p>
-    <w:p>
-      <w:pPr>
-        <w:pStyle w:val="Heading1"/>
-      </w:pPr>
-      <w:r>
-        <w:t>Showing HTTP Traffic</w:t>
-      </w:r>
-    </w:p>
-    <w:p>
-      <w:r>
-        <w:t xml:space="preserve">The MainContent component </w:t>
-      </w:r>
-      <w:r>
-        <w:t>uses</w:t>
-      </w:r>
-      <w:r>
-        <w:t xml:space="preserve"> </w:t>
-      </w:r>
-      <w:r>
-        <w:t xml:space="preserve">the </w:t>
-      </w:r>
-      <w:r>
-        <w:t xml:space="preserve">HTTP </w:t>
-      </w:r>
-      <w:r>
-        <w:t xml:space="preserve">services MusicBrainz, CoverArtArchive and LrcLib </w:t>
-      </w:r>
-      <w:r>
-        <w:t xml:space="preserve">to </w:t>
-      </w:r>
-      <w:r>
-        <w:t>get</w:t>
-      </w:r>
-      <w:r>
-        <w:t xml:space="preserve"> data</w:t>
-      </w:r>
-      <w:r>
-        <w:t>. In Blazor, which is based on ASP.NET, we don’t instantiate services directly. Instead, we tell the application Builder to create the service for us, as shown in the next listing.</w:t>
-      </w:r>
-    </w:p>
-    <w:p>
-      <w:pPr>
-        <w:spacing w:after="0"/>
-        <w:rPr>
-          <w:rFonts w:ascii="Courier New" w:hAnsi="Courier New" w:cs="Courier New"/>
-          <w:noProof/>
-          <w:sz w:val="18"/>
-          <w:szCs w:val="18"/>
-        </w:rPr>
-      </w:pPr>
-      <w:r>
-        <w:rPr>
-          <w:rFonts w:ascii="Courier New" w:hAnsi="Courier New" w:cs="Courier New"/>
-          <w:noProof/>
-          <w:sz w:val="18"/>
-          <w:szCs w:val="18"/>
-        </w:rPr>
-        <w:t>var builder = WebAssemblyHostBuilder.CreateDefault(args);</w:t>
-      </w:r>
-    </w:p>
-    <w:p>
-      <w:pPr>
-        <w:spacing w:after="0"/>
-        <w:rPr>
-          <w:rFonts w:ascii="Courier New" w:hAnsi="Courier New" w:cs="Courier New"/>
-          <w:noProof/>
-          <w:sz w:val="18"/>
-          <w:szCs w:val="18"/>
-        </w:rPr>
-      </w:pPr>
-      <w:r>
-        <w:rPr>
-          <w:rFonts w:ascii="Courier New" w:hAnsi="Courier New" w:cs="Courier New"/>
-          <w:noProof/>
-          <w:sz w:val="18"/>
-          <w:szCs w:val="18"/>
-        </w:rPr>
-        <w:t>//...</w:t>
-      </w:r>
-    </w:p>
-    <w:p>
-      <w:pPr>
-        <w:spacing w:after="0"/>
-        <w:rPr>
-          <w:rStyle w:val="code"/>
-        </w:rPr>
-      </w:pPr>
-      <w:r>
-        <w:rPr>
-          <w:rStyle w:val="code"/>
-        </w:rPr>
-        <w:t>builder.Services.AddHttpClient&lt;MusicBrainz&gt;();</w:t>
-      </w:r>
-    </w:p>
-    <w:p>
-      <w:pPr>
-        <w:spacing w:after="0"/>
-        <w:rPr>
-          <w:rStyle w:val="code"/>
-        </w:rPr>
-      </w:pPr>
-      <w:r>
-        <w:rPr>
-          <w:rStyle w:val="code"/>
-        </w:rPr>
-        <w:t>builder.Services.AddHttpClient&lt;CoverArtArchive&gt;();</w:t>
-      </w:r>
-    </w:p>
-    <w:p>
-      <w:pPr>
-        <w:spacing w:after="0"/>
-        <w:rPr>
-          <w:rStyle w:val="code"/>
-        </w:rPr>
-      </w:pPr>
-      <w:r>
-        <w:rPr>
-          <w:rStyle w:val="code"/>
-        </w:rPr>
-        <w:t>builder.Services.AddHttpClient&lt;LrcLib&gt;();</w:t>
-      </w:r>
-    </w:p>
-    <w:p>
-      <w:pPr>
-        <w:spacing w:after="0"/>
-        <w:rPr>
-          <w:rStyle w:val="code"/>
-        </w:rPr>
-      </w:pPr>
-    </w:p>
-    <w:p>
-      <w:pPr>
-        <w:pStyle w:val="Caption"/>
-      </w:pPr>
-      <w:r>
-        <w:t xml:space="preserve">Listing </w:t>
-      </w:r>
-      <w:r>
-        <w:fldChar w:fldCharType="begin"/>
-      </w:r>
-      <w:r>
-        <w:instrText xml:space="preserve"> SEQ Listing \* ARABIC </w:instrText>
-      </w:r>
-      <w:r>
-        <w:fldChar w:fldCharType="separate"/>
-      </w:r>
-      <w:r>
-        <w:rPr>
-          <w:noProof/>
-        </w:rPr>
-        <w:t>4</w:t>
-      </w:r>
-      <w:r>
-        <w:fldChar w:fldCharType="end"/>
-      </w:r>
-      <w:r>
-        <w:t xml:space="preserve">- </w:t>
-      </w:r>
-      <w:r>
-        <w:t>Call the app Builder in Program.cs to instantiate our HTTP web services.</w:t>
+      <w:fldSimple w:instr=" SEQ Listing \* ARABIC ">
+        <w:r>
+          <w:rPr>
+            <w:noProof/>
+          </w:rPr>
+          <w:t>4</w:t>
+        </w:r>
+      </w:fldSimple>
+      <w:r>
+        <w:t>- Call the app Builder in Program.cs to instantiate our HTTP web services.</w:t>
       </w:r>
     </w:p>
     <w:p>
@@ -1978,24 +1854,14 @@
       <w:r>
         <w:t xml:space="preserve">Figure </w:t>
       </w:r>
-      <w:r>
-        <w:fldChar w:fldCharType="begin"/>
-      </w:r>
-      <w:r>
-        <w:instrText xml:space="preserve"> SEQ Figure \* ARABIC </w:instrText>
-      </w:r>
-      <w:r>
-        <w:fldChar w:fldCharType="separate"/>
-      </w:r>
-      <w:r>
-        <w:rPr>
-          <w:noProof/>
-        </w:rPr>
-        <w:t>6</w:t>
-      </w:r>
-      <w:r>
-        <w:fldChar w:fldCharType="end"/>
-      </w:r>
+      <w:fldSimple w:instr=" SEQ Figure \* ARABIC ">
+        <w:r>
+          <w:rPr>
+            <w:noProof/>
+          </w:rPr>
+          <w:t>6</w:t>
+        </w:r>
+      </w:fldSimple>
       <w:r>
         <w:t xml:space="preserve"> – The events exposed by the </w:t>
       </w:r>
@@ -2402,63 +2268,35 @@
       <w:r>
         <w:t xml:space="preserve">Listing </w:t>
       </w:r>
-      <w:r>
-        <w:fldChar w:fldCharType="begin"/>
-      </w:r>
-      <w:r>
-        <w:instrText xml:space="preserve"> SEQ Listing \* ARABIC </w:instrText>
-      </w:r>
-      <w:r>
-        <w:fldChar w:fldCharType="separate"/>
-      </w:r>
-      <w:r>
-        <w:rPr>
-          <w:noProof/>
-        </w:rPr>
-        <w:t>5</w:t>
-      </w:r>
-      <w:r>
-        <w:fldChar w:fldCharType="end"/>
-      </w:r>
-      <w:r>
-        <w:t xml:space="preserve">- </w:t>
-      </w:r>
-      <w:r>
-        <w:t xml:space="preserve">The code in Home.razor that </w:t>
+      <w:fldSimple w:instr=" SEQ Listing \* ARABIC ">
+        <w:r>
+          <w:rPr>
+            <w:noProof/>
+          </w:rPr>
+          <w:t>5</w:t>
+        </w:r>
+      </w:fldSimple>
+      <w:r>
+        <w:t xml:space="preserve">- The code in Home.razor that </w:t>
       </w:r>
       <w:r>
         <w:t>deals with</w:t>
       </w:r>
       <w:r>
-        <w:t xml:space="preserve"> the ProgressChanged event</w:t>
-      </w:r>
-      <w:r>
-        <w:t>.</w:t>
-      </w:r>
-    </w:p>
-    <w:p>
-      <w:pPr>
-        <w:spacing w:after="0"/>
-        <w:rPr>
-          <w:rStyle w:val="code"/>
-        </w:rPr>
-      </w:pPr>
-    </w:p>
-    <w:p>
-      <w:r>
-        <w:t xml:space="preserve">The other two events </w:t>
-      </w:r>
-      <w:r>
-        <w:t xml:space="preserve">– LogMessage and LogException </w:t>
-      </w:r>
-      <w:r>
-        <w:t>–</w:t>
-      </w:r>
-      <w:r>
-        <w:t xml:space="preserve"> </w:t>
-      </w:r>
-      <w:r>
-        <w:t>are handled by MainContent by updating the HTTP Log.</w:t>
+        <w:t xml:space="preserve"> the ProgressChanged event.</w:t>
+      </w:r>
+    </w:p>
+    <w:p>
+      <w:pPr>
+        <w:spacing w:after="0"/>
+        <w:rPr>
+          <w:rStyle w:val="code"/>
+        </w:rPr>
+      </w:pPr>
+    </w:p>
+    <w:p>
+      <w:r>
+        <w:t>The other two events – LogMessage and LogException – are handled by MainContent by updating the HTTP Log.</w:t>
       </w:r>
     </w:p>
     <w:p>
@@ -2696,44 +2534,16 @@
       <w:r>
         <w:t xml:space="preserve">Listing </w:t>
       </w:r>
-      <w:r>
-        <w:fldChar w:fldCharType="begin"/>
-      </w:r>
-      <w:r>
-        <w:instrText xml:space="preserve"> SEQ Listing \* ARABIC </w:instrText>
-      </w:r>
-      <w:r>
-        <w:fldChar w:fldCharType="separate"/>
-      </w:r>
-      <w:r>
-        <w:rPr>
-          <w:noProof/>
-        </w:rPr>
-        <w:t>6</w:t>
-      </w:r>
-      <w:r>
-        <w:fldChar w:fldCharType="end"/>
-      </w:r>
-      <w:r>
-        <w:t xml:space="preserve">- The code in </w:t>
-      </w:r>
-      <w:r>
-        <w:t>MainContent</w:t>
-      </w:r>
-      <w:r>
-        <w:t xml:space="preserve">.razor that handles the </w:t>
-      </w:r>
-      <w:r>
-        <w:t>LogMessage and LogException</w:t>
-      </w:r>
-      <w:r>
-        <w:t xml:space="preserve"> event</w:t>
-      </w:r>
-      <w:r>
-        <w:t>s</w:t>
-      </w:r>
-      <w:r>
-        <w:t>.</w:t>
+      <w:fldSimple w:instr=" SEQ Listing \* ARABIC ">
+        <w:r>
+          <w:rPr>
+            <w:noProof/>
+          </w:rPr>
+          <w:t>6</w:t>
+        </w:r>
+      </w:fldSimple>
+      <w:r>
+        <w:t>- The code in MainContent.razor that handles the LogMessage and LogException events.</w:t>
       </w:r>
     </w:p>
     <w:p>
@@ -2861,24 +2671,14 @@
       <w:r>
         <w:t xml:space="preserve">Figure </w:t>
       </w:r>
-      <w:r>
-        <w:fldChar w:fldCharType="begin"/>
-      </w:r>
-      <w:r>
-        <w:instrText xml:space="preserve"> SEQ Figure \* ARABIC </w:instrText>
-      </w:r>
-      <w:r>
-        <w:fldChar w:fldCharType="separate"/>
-      </w:r>
-      <w:r>
-        <w:rPr>
-          <w:noProof/>
-        </w:rPr>
-        <w:t>7</w:t>
-      </w:r>
-      <w:r>
-        <w:fldChar w:fldCharType="end"/>
-      </w:r>
+      <w:fldSimple w:instr=" SEQ Figure \* ARABIC ">
+        <w:r>
+          <w:rPr>
+            <w:noProof/>
+          </w:rPr>
+          <w:t>7</w:t>
+        </w:r>
+      </w:fldSimple>
       <w:r>
         <w:t xml:space="preserve"> – The HTTP Log showing a communication error in red.</w:t>
       </w:r>
@@ -2934,12 +2734,23 @@
     </w:p>
     <w:p>
       <w:r>
-        <w:t>There are many aspects of Blazor I didn’t cover here, including the syntax of razor files, how to handle dialog boxes. For all the details, see the source code on GitHub.</w:t>
+        <w:t xml:space="preserve">There are many aspects of Blazor I didn’t cover here, including the syntax of razor files, how to handle dialog boxes. For all the details, see the </w:t>
+      </w:r>
+      <w:hyperlink r:id="rId17" w:history="1">
+        <w:r>
+          <w:rPr>
+            <w:rStyle w:val="Hyperlink"/>
+          </w:rPr>
+          <w:t>source code</w:t>
+        </w:r>
+      </w:hyperlink>
+      <w:r>
+        <w:t xml:space="preserve"> on GitHub.</w:t>
       </w:r>
     </w:p>
     <w:p/>
     <w:sectPr>
-      <w:footerReference w:type="default" r:id="rId17"/>
+      <w:footerReference w:type="default" r:id="rId18"/>
       <w:pgSz w:w="12240" w:h="15840"/>
       <w:pgMar w:top="720" w:right="990" w:bottom="720" w:left="1170" w:header="720" w:footer="720" w:gutter="0"/>
       <w:cols w:space="720"/>
@@ -3908,6 +3719,7 @@
   <w:style w:type="character" w:default="1" w:styleId="DefaultParagraphFont">
     <w:name w:val="Default Paragraph Font"/>
     <w:uiPriority w:val="1"/>
+    <w:semiHidden/>
     <w:unhideWhenUsed/>
   </w:style>
   <w:style w:type="table" w:default="1" w:styleId="TableNormal">

</xml_diff>